<commit_message>
asus nitro 5 pro
asus nitro 5 pro
</commit_message>
<xml_diff>
--- a/NOTES/1_springboot internal working.docx
+++ b/NOTES/1_springboot internal working.docx
@@ -1061,21 +1061,7 @@
         <w:rPr>
           <w:lang w:val="en-US"/>
         </w:rPr>
-        <w:t xml:space="preserve"> </w:t>
-      </w:r>
-      <w:proofErr w:type="gramStart"/>
-      <w:r>
-        <w:rPr>
-          <w:lang w:val="en-US"/>
-        </w:rPr>
-        <w:t>won’t</w:t>
-      </w:r>
-      <w:proofErr w:type="gramEnd"/>
-      <w:r>
-        <w:rPr>
-          <w:lang w:val="en-US"/>
-        </w:rPr>
-        <w:t xml:space="preserve"> </w:t>
+        <w:t xml:space="preserve"> won’t </w:t>
       </w:r>
       <w:proofErr w:type="gramStart"/>
       <w:r>
@@ -1664,17 +1650,31 @@
         </w:rPr>
         <w:t xml:space="preserve">return new </w:t>
       </w:r>
-      <w:r>
-        <w:rPr>
-          <w:rFonts w:ascii="Courier New" w:eastAsia="Times New Roman" w:hAnsi="Courier New" w:cs="Courier New"/>
-          <w:color w:val="BCBEC4"/>
-          <w:kern w:val="0"/>
-          <w:sz w:val="20"/>
-          <w:szCs w:val="20"/>
-          <w:lang w:eastAsia="en-IN"/>
-          <w14:ligatures w14:val="none"/>
-        </w:rPr>
-        <w:t>ArrayList&lt;&gt;(</w:t>
+      <w:proofErr w:type="spellStart"/>
+      <w:r>
+        <w:rPr>
+          <w:rFonts w:ascii="Courier New" w:eastAsia="Times New Roman" w:hAnsi="Courier New" w:cs="Courier New"/>
+          <w:color w:val="BCBEC4"/>
+          <w:kern w:val="0"/>
+          <w:sz w:val="20"/>
+          <w:szCs w:val="20"/>
+          <w:lang w:eastAsia="en-IN"/>
+          <w14:ligatures w14:val="none"/>
+        </w:rPr>
+        <w:t>ArrayList</w:t>
+      </w:r>
+      <w:proofErr w:type="spellEnd"/>
+      <w:r>
+        <w:rPr>
+          <w:rFonts w:ascii="Courier New" w:eastAsia="Times New Roman" w:hAnsi="Courier New" w:cs="Courier New"/>
+          <w:color w:val="BCBEC4"/>
+          <w:kern w:val="0"/>
+          <w:sz w:val="20"/>
+          <w:szCs w:val="20"/>
+          <w:lang w:eastAsia="en-IN"/>
+          <w14:ligatures w14:val="none"/>
+        </w:rPr>
+        <w:t>&lt;&gt;(</w:t>
       </w:r>
       <w:proofErr w:type="spellStart"/>
       <w:r>
@@ -3229,6 +3229,214 @@
           </wp:inline>
         </w:drawing>
       </w:r>
+    </w:p>
+    <w:p>
+      <w:pPr>
+        <w:pStyle w:val="ListParagraph"/>
+        <w:rPr>
+          <w:lang w:val="en-US"/>
+        </w:rPr>
+      </w:pPr>
+    </w:p>
+    <w:p>
+      <w:pPr>
+        <w:pStyle w:val="ListParagraph"/>
+        <w:numPr>
+          <w:ilvl w:val="0"/>
+          <w:numId w:val="1"/>
+        </w:numPr>
+        <w:rPr>
+          <w:lang w:val="en-US"/>
+        </w:rPr>
+      </w:pPr>
+      <w:proofErr w:type="gramStart"/>
+      <w:r>
+        <w:rPr>
+          <w:lang w:val="en-US"/>
+        </w:rPr>
+        <w:t>Control ,</w:t>
+      </w:r>
+      <w:proofErr w:type="gramEnd"/>
+      <w:r>
+        <w:rPr>
+          <w:lang w:val="en-US"/>
+        </w:rPr>
+        <w:t xml:space="preserve"> service, repository:</w:t>
+      </w:r>
+    </w:p>
+    <w:p>
+      <w:pPr>
+        <w:pStyle w:val="ListParagraph"/>
+        <w:rPr>
+          <w:lang w:val="en-US"/>
+        </w:rPr>
+      </w:pPr>
+      <w:r>
+        <w:rPr>
+          <w:lang w:val="en-US"/>
+        </w:rPr>
+        <w:t>Control -&gt; Service -&gt; repository</w:t>
+      </w:r>
+    </w:p>
+    <w:p>
+      <w:pPr>
+        <w:pStyle w:val="HTMLPreformatted"/>
+        <w:shd w:val="clear" w:color="auto" w:fill="191A1C"/>
+        <w:rPr>
+          <w:color w:val="BCBEC4"/>
+        </w:rPr>
+      </w:pPr>
+      <w:r>
+        <w:rPr>
+          <w:color w:val="CF8E6D"/>
+        </w:rPr>
+        <w:t xml:space="preserve">public interface </w:t>
+      </w:r>
+      <w:proofErr w:type="spellStart"/>
+      <w:r>
+        <w:rPr>
+          <w:color w:val="BCBEC4"/>
+        </w:rPr>
+        <w:t>JournalEntryRepository</w:t>
+      </w:r>
+      <w:proofErr w:type="spellEnd"/>
+      <w:r>
+        <w:rPr>
+          <w:color w:val="BCBEC4"/>
+        </w:rPr>
+        <w:t xml:space="preserve"> </w:t>
+      </w:r>
+      <w:r>
+        <w:rPr>
+          <w:color w:val="CF8E6D"/>
+        </w:rPr>
+        <w:t xml:space="preserve">extends </w:t>
+      </w:r>
+      <w:proofErr w:type="spellStart"/>
+      <w:r>
+        <w:rPr>
+          <w:color w:val="BCBEC4"/>
+        </w:rPr>
+        <w:t>MongoRepository</w:t>
+      </w:r>
+      <w:proofErr w:type="spellEnd"/>
+      <w:r>
+        <w:rPr>
+          <w:color w:val="BCBEC4"/>
+        </w:rPr>
+        <w:t>&lt;</w:t>
+      </w:r>
+      <w:proofErr w:type="spellStart"/>
+      <w:proofErr w:type="gramStart"/>
+      <w:r>
+        <w:rPr>
+          <w:color w:val="BCBEC4"/>
+        </w:rPr>
+        <w:t>JournalEntry,String</w:t>
+      </w:r>
+      <w:proofErr w:type="spellEnd"/>
+      <w:proofErr w:type="gramEnd"/>
+      <w:r>
+        <w:rPr>
+          <w:color w:val="BCBEC4"/>
+        </w:rPr>
+        <w:t>&gt; {</w:t>
+      </w:r>
+      <w:r>
+        <w:rPr>
+          <w:color w:val="BCBEC4"/>
+        </w:rPr>
+        <w:br/>
+      </w:r>
+      <w:r>
+        <w:rPr>
+          <w:color w:val="BCBEC4"/>
+        </w:rPr>
+        <w:br/>
+        <w:t>}</w:t>
+      </w:r>
+    </w:p>
+    <w:p>
+      <w:pPr>
+        <w:pStyle w:val="ListParagraph"/>
+        <w:rPr>
+          <w:lang w:val="en-US"/>
+        </w:rPr>
+      </w:pPr>
+      <w:proofErr w:type="spellStart"/>
+      <w:proofErr w:type="gramStart"/>
+      <w:r>
+        <w:rPr>
+          <w:lang w:val="en-US"/>
+        </w:rPr>
+        <w:t>Here,MongoRepository</w:t>
+      </w:r>
+      <w:proofErr w:type="spellEnd"/>
+      <w:proofErr w:type="gramEnd"/>
+      <w:r>
+        <w:rPr>
+          <w:lang w:val="en-US"/>
+        </w:rPr>
+        <w:t xml:space="preserve">&lt;Object ka name </w:t>
+      </w:r>
+      <w:proofErr w:type="spellStart"/>
+      <w:r>
+        <w:rPr>
+          <w:lang w:val="en-US"/>
+        </w:rPr>
+        <w:t>jispe</w:t>
+      </w:r>
+      <w:proofErr w:type="spellEnd"/>
+      <w:r>
+        <w:rPr>
+          <w:lang w:val="en-US"/>
+        </w:rPr>
+        <w:t xml:space="preserve"> work </w:t>
+      </w:r>
+      <w:proofErr w:type="spellStart"/>
+      <w:r>
+        <w:rPr>
+          <w:lang w:val="en-US"/>
+        </w:rPr>
+        <w:t>karna</w:t>
+      </w:r>
+      <w:proofErr w:type="spellEnd"/>
+      <w:r>
+        <w:rPr>
+          <w:lang w:val="en-US"/>
+        </w:rPr>
+        <w:t xml:space="preserve"> </w:t>
+      </w:r>
+      <w:proofErr w:type="spellStart"/>
+      <w:proofErr w:type="gramStart"/>
+      <w:r>
+        <w:rPr>
+          <w:lang w:val="en-US"/>
+        </w:rPr>
+        <w:t>hai</w:t>
+      </w:r>
+      <w:proofErr w:type="spellEnd"/>
+      <w:r>
+        <w:rPr>
+          <w:lang w:val="en-US"/>
+        </w:rPr>
+        <w:t xml:space="preserve"> ,</w:t>
+      </w:r>
+      <w:proofErr w:type="gramEnd"/>
+      <w:r>
+        <w:rPr>
+          <w:lang w:val="en-US"/>
+        </w:rPr>
+        <w:t xml:space="preserve"> ID ka type&gt;</w:t>
+      </w:r>
+    </w:p>
+    <w:p>
+      <w:pPr>
+        <w:pStyle w:val="ListParagraph"/>
+        <w:rPr>
+          <w:lang w:val="en-US"/>
+        </w:rPr>
+      </w:pPr>
     </w:p>
     <w:p>
       <w:pPr>
@@ -4064,7 +4272,6 @@
   <w:style w:type="character" w:default="1" w:styleId="DefaultParagraphFont">
     <w:name w:val="Default Paragraph Font"/>
     <w:uiPriority w:val="1"/>
-    <w:semiHidden/>
     <w:unhideWhenUsed/>
   </w:style>
   <w:style w:type="table" w:default="1" w:styleId="TableNormal">

</xml_diff>